<commit_message>
feat: Hoan thien 33 anh thuc te man hinh & modal, tai lieu Word/PDF 8.7MB va tich hop trang Gioi thieu /guide
</commit_message>
<xml_diff>
--- a/Tai_Lieu_Mo_Ta_He_Thong_Quan_Ly_Ben_Bai_Son_Cang.docx
+++ b/Tai_Lieu_Mo_Ta_He_Thong_Quan_Ly_Ben_Bai_Son_Cang.docx
@@ -1181,7 +1181,7 @@
         <w:t xml:space="preserve">Theo dõi phiên cắm/rút thời gian thực: </w:t>
       </w:r>
       <w:r>
-        <w:t>Ghi nhận chính xác thời điểm cắm giắc điện, thời điểm rút giắc, vị trí trụ cắm và cán bộ thực hiện kèm đồng hồ đếm thời gian thực.</w:t>
+        <w:t>Ghi nhận chính xác thời điểm cắm giắc điện, thời điểm rút giắc, Tủ điện &amp; mã giắc cắm (thuộc hệ thống 13 Tủ / 50 Giắc 380V Khu A) và cán bộ thực hiện kèm đồng hồ đếm thời gian thực.</w:t>
       </w:r>
     </w:p>
     <w:p>
@@ -1291,6 +1291,36 @@
       </w:r>
       <w:r>
         <w:t>Tự động phân loại cảnh báo ≥ 24h và ≥ 48h, đồng thời hiển thị trực quan cước lưu bãi tạm tính 'Lưu bãi: ~X đ (Y đêm)' của từng container theo khung 22h-06h (miễn đêm đầu).</w:t>
+      </w:r>
+    </w:p>
+    <w:p>
+      <w:pPr>
+        <w:pStyle w:val="ListBullet"/>
+        <w:spacing w:after="40"/>
+      </w:pPr>
+      <w:r>
+        <w:rPr>
+          <w:b/>
+        </w:rPr>
+        <w:t xml:space="preserve">Quy hoạch Hệ thống Cấp điện 13 Tủ điện — 50 Giắc cắm 380V (Khu A): </w:t>
+      </w:r>
+      <w:r>
+        <w:t>Chuẩn hóa lưới điện lạnh thành 13 Tủ công nghiệp (T01..T13) với 50 ổ cắm chuyên dụng (T01: 3, T02: 4, T03: 4, T04: 3, T05: 8, T06: 3, T07: 3, T08: 2, T09: 5, T10: 3, T11: 4, T12: 4, T13: 4). Trang bị bộ công cụ CRUD quản lý tủ điện (+ Thêm tủ, + Ổ, Bật/Tắt bảo trì toàn tủ 1-chạm, Cắm nhanh container tại bãi).</w:t>
+      </w:r>
+    </w:p>
+    <w:p>
+      <w:pPr>
+        <w:pStyle w:val="ListBullet"/>
+        <w:spacing w:after="40"/>
+      </w:pPr>
+      <w:r>
+        <w:rPr>
+          <w:b/>
+        </w:rPr>
+        <w:t xml:space="preserve">Thiết kế công thái học (Thu gọn Aside): </w:t>
+      </w:r>
+      <w:r>
+        <w:t>Bảng phụ Hàng đợi bến bãi và phân khu mặc định thu gọn (Aside w-12), mở rộng linh hoạt w-80 giúp giải phóng tối đa không gian hiển thị bảng dữ liệu chính.</w:t>
       </w:r>
     </w:p>
     <w:p>

</xml_diff>